<commit_message>
Fix nöbet_başı distribution to scale proportionally with seniority
</commit_message>
<xml_diff>
--- a/notlar.docx
+++ b/notlar.docx
@@ -397,6 +397,33 @@
         <w:rPr>
           <w:lang w:val="tr-TR"/>
         </w:rPr>
+        <w:tab/>
+        <w:t>Kıdemle oran orantılı olsun</w:t>
+      </w:r>
+    </w:p>
+    <w:p>
+      <w:pPr>
+        <w:rPr>
+          <w:lang w:val="tr-TR"/>
+        </w:rPr>
+      </w:pPr>
+      <w:r>
+        <w:rPr>
+          <w:lang w:val="tr-TR"/>
+        </w:rPr>
+        <w:t>Çömez_başı, sadece kıdemlı olabilir</w:t>
+      </w:r>
+    </w:p>
+    <w:p>
+      <w:pPr>
+        <w:rPr>
+          <w:lang w:val="tr-TR"/>
+        </w:rPr>
+      </w:pPr>
+      <w:r>
+        <w:rPr>
+          <w:lang w:val="tr-TR"/>
+        </w:rPr>
         <w:t>Kapıcı</w:t>
       </w:r>
       <w:r>
@@ -416,25 +443,6 @@
         <w:rPr>
           <w:lang w:val="tr-TR"/>
         </w:rPr>
-        <w:t>Çömez_başı</w:t>
-      </w:r>
-      <w:r>
-        <w:rPr>
-          <w:lang w:val="tr-TR"/>
-        </w:rPr>
-        <w:t>, sadece kıdemlı olabilir</w:t>
-      </w:r>
-    </w:p>
-    <w:p>
-      <w:pPr>
-        <w:rPr>
-          <w:lang w:val="tr-TR"/>
-        </w:rPr>
-      </w:pPr>
-      <w:r>
-        <w:rPr>
-          <w:lang w:val="tr-TR"/>
-        </w:rPr>
         <w:t>Çömez</w:t>
       </w:r>
       <w:r>
@@ -750,6 +758,7 @@
         <w:rPr>
           <w:lang w:val="tr-TR"/>
         </w:rPr>
+        <w:lastRenderedPageBreak/>
         <w:t>Her</w:t>
       </w:r>
       <w:r>
@@ -775,632 +784,632 @@
         <w:rPr>
           <w:lang w:val="tr-TR"/>
         </w:rPr>
+        <w:t xml:space="preserve"> </w:t>
+      </w:r>
+    </w:p>
+    <w:p>
+      <w:pPr>
+        <w:rPr>
+          <w:lang w:val="tr-TR"/>
+        </w:rPr>
+      </w:pPr>
+      <w:r>
+        <w:rPr>
+          <w:lang w:val="tr-TR"/>
+        </w:rPr>
+        <w:t>1 kıdemli nöbet_başı</w:t>
+      </w:r>
+    </w:p>
+    <w:p>
+      <w:pPr>
+        <w:rPr>
+          <w:lang w:val="tr-TR"/>
+        </w:rPr>
+      </w:pPr>
+      <w:r>
+        <w:rPr>
+          <w:lang w:val="tr-TR"/>
+        </w:rPr>
+        <w:t>En az 1 çömez</w:t>
+      </w:r>
+      <w:r>
+        <w:rPr>
+          <w:lang w:val="tr-TR"/>
+        </w:rPr>
+        <w:t>_başı</w:t>
+      </w:r>
+    </w:p>
+    <w:p>
+      <w:pPr>
+        <w:rPr>
+          <w:lang w:val="tr-TR"/>
+        </w:rPr>
+      </w:pPr>
+      <w:r>
+        <w:rPr>
+          <w:lang w:val="tr-TR"/>
+        </w:rPr>
+        <w:t>Kıdemsiz çömezler</w:t>
+      </w:r>
+    </w:p>
+    <w:p>
+      <w:pPr>
+        <w:rPr>
+          <w:lang w:val="tr-TR"/>
+        </w:rPr>
+      </w:pPr>
+      <w:r>
+        <w:rPr>
+          <w:lang w:val="tr-TR"/>
+        </w:rPr>
+        <w:t>1 kıdemli kapıcı (sadece sabah vardiyasında)</w:t>
+      </w:r>
+    </w:p>
+    <w:p>
+      <w:pPr>
+        <w:rPr>
+          <w:lang w:val="tr-TR"/>
+        </w:rPr>
+      </w:pPr>
+    </w:p>
+    <w:p>
+      <w:pPr>
+        <w:rPr>
+          <w:lang w:val="tr-TR"/>
+        </w:rPr>
+      </w:pPr>
+      <w:r>
+        <w:rPr>
+          <w:lang w:val="tr-TR"/>
+        </w:rPr>
+        <w:t xml:space="preserve">Float </w:t>
+      </w:r>
+      <w:r>
+        <w:rPr>
+          <w:lang w:val="tr-TR"/>
+        </w:rPr>
+        <w:t>Toplam</w:t>
+      </w:r>
+      <w:r>
+        <w:rPr>
+          <w:lang w:val="tr-TR"/>
+        </w:rPr>
+        <w:t>_</w:t>
+      </w:r>
+      <w:r>
+        <w:rPr>
+          <w:lang w:val="tr-TR"/>
+        </w:rPr>
+        <w:t>çömez</w:t>
+      </w:r>
+      <w:r>
+        <w:rPr>
+          <w:lang w:val="tr-TR"/>
+        </w:rPr>
+        <w:t>_</w:t>
+      </w:r>
+      <w:r>
+        <w:rPr>
+          <w:lang w:val="tr-TR"/>
+        </w:rPr>
+        <w:t>sayısı</w:t>
+      </w:r>
+      <w:r>
+        <w:rPr>
+          <w:lang w:val="tr-TR"/>
+        </w:rPr>
+        <w:t>_</w:t>
+      </w:r>
+      <w:r>
+        <w:rPr>
+          <w:lang w:val="tr-TR"/>
+        </w:rPr>
+        <w:t xml:space="preserve">ortalaması için formül: </w:t>
+      </w:r>
+      <w:r>
+        <w:rPr>
+          <w:lang w:val="tr-TR"/>
+        </w:rPr>
+        <w:t>(input olarak hangi ay olduğu girilir)</w:t>
+      </w:r>
+      <w:r>
+        <w:rPr>
+          <w:lang w:val="tr-TR"/>
+        </w:rPr>
+        <w:t xml:space="preserve"> (çömez başını çömez saymıyoruz)</w:t>
+      </w:r>
+    </w:p>
+    <w:p>
+      <w:pPr>
+        <w:rPr>
+          <w:lang w:val="tr-TR"/>
+        </w:rPr>
+      </w:pPr>
+      <w:r>
+        <w:rPr>
+          <w:lang w:val="tr-TR"/>
+        </w:rPr>
+        <w:t xml:space="preserve">30 çeken aylar: </w:t>
+      </w:r>
+      <w:r>
+        <w:rPr>
+          <w:lang w:val="tr-TR"/>
+        </w:rPr>
+        <w:t>(</w:t>
+      </w:r>
+      <w:r>
+        <w:rPr>
+          <w:lang w:val="tr-TR"/>
+        </w:rPr>
+        <w:t>(toplam_nöbet_sayısı – 90)/60</w:t>
+      </w:r>
+      <w:r>
+        <w:rPr>
+          <w:lang w:val="tr-TR"/>
+        </w:rPr>
+        <w:t>) - 1</w:t>
+      </w:r>
+    </w:p>
+    <w:p>
+      <w:pPr>
+        <w:rPr>
+          <w:lang w:val="tr-TR"/>
+        </w:rPr>
+      </w:pPr>
+      <w:r>
+        <w:rPr>
+          <w:lang w:val="tr-TR"/>
+        </w:rPr>
+        <w:t xml:space="preserve">31 çeken aylar: </w:t>
+      </w:r>
+      <w:r>
+        <w:rPr>
+          <w:lang w:val="tr-TR"/>
+        </w:rPr>
+        <w:t>(</w:t>
+      </w:r>
+      <w:r>
+        <w:rPr>
+          <w:lang w:val="tr-TR"/>
+        </w:rPr>
+        <w:t>(toplam_nöbet_sayısı – 93)/62</w:t>
+      </w:r>
+      <w:r>
+        <w:rPr>
+          <w:lang w:val="tr-TR"/>
+        </w:rPr>
+        <w:t>) - 1</w:t>
+      </w:r>
+    </w:p>
+    <w:p>
+      <w:pPr>
+        <w:rPr>
+          <w:lang w:val="tr-TR"/>
+        </w:rPr>
+      </w:pPr>
+    </w:p>
+    <w:p>
+      <w:pPr>
+        <w:rPr>
+          <w:lang w:val="tr-TR"/>
+        </w:rPr>
+      </w:pPr>
+      <w:r>
+        <w:rPr>
+          <w:lang w:val="tr-TR"/>
+        </w:rPr>
+        <w:t xml:space="preserve">Toplam_nöbet_sayısı </w:t>
+      </w:r>
+      <w:r>
+        <w:rPr>
+          <w:lang w:val="tr-TR"/>
+        </w:rPr>
+        <w:t>=</w:t>
+      </w:r>
+      <w:r>
+        <w:rPr>
+          <w:lang w:val="tr-TR"/>
+        </w:rPr>
+        <w:t xml:space="preserve"> doktorlar için nöbet sayısı toplamı</w:t>
+      </w:r>
+    </w:p>
+    <w:p>
+      <w:pPr>
+        <w:rPr>
+          <w:lang w:val="tr-TR"/>
+        </w:rPr>
+      </w:pPr>
+      <w:r>
+        <w:rPr>
+          <w:lang w:val="tr-TR"/>
+        </w:rPr>
+        <w:t xml:space="preserve">Float </w:t>
+      </w:r>
+      <w:r>
+        <w:rPr>
+          <w:lang w:val="tr-TR"/>
+        </w:rPr>
+        <w:t xml:space="preserve"> </w:t>
+      </w:r>
+      <w:r>
+        <w:rPr>
+          <w:lang w:val="tr-TR"/>
+        </w:rPr>
+        <w:t>toplam_çömez_sayısı</w:t>
+      </w:r>
+      <w:r>
+        <w:rPr>
+          <w:lang w:val="tr-TR"/>
+        </w:rPr>
+        <w:t>_ortalaması d</w:t>
+      </w:r>
+      <w:r>
+        <w:rPr>
+          <w:lang w:val="tr-TR"/>
+        </w:rPr>
+        <w:t xml:space="preserve">ağıtım kuralı (küsuratlı ortalama için): </w:t>
+      </w:r>
+    </w:p>
+    <w:p>
+      <w:pPr>
+        <w:rPr>
+          <w:lang w:val="tr-TR"/>
+        </w:rPr>
+      </w:pPr>
+      <w:r>
+        <w:rPr>
+          <w:lang w:val="tr-TR"/>
+        </w:rPr>
+        <w:t xml:space="preserve">Ortalama küsuratlıysa, toplam_çömez_sayısı kadar tam sayı slot, bazı nöbetlerde taban(floor), bazılarında tavan(ceil) olacak şekilde dağıtılır. </w:t>
+      </w:r>
+      <w:r>
+        <w:rPr>
+          <w:lang w:val="tr-TR"/>
+        </w:rPr>
+        <w:t>gece</w:t>
+      </w:r>
+      <w:r>
+        <w:rPr>
+          <w:lang w:val="tr-TR"/>
+        </w:rPr>
+        <w:t xml:space="preserve"> nöbetler öncelikli tavan alır</w:t>
+      </w:r>
+      <w:r>
+        <w:rPr>
+          <w:lang w:val="tr-TR"/>
+        </w:rPr>
+        <w:t xml:space="preserve"> (random). </w:t>
+      </w:r>
+    </w:p>
+    <w:p>
+      <w:pPr>
+        <w:rPr>
+          <w:lang w:val="tr-TR"/>
+        </w:rPr>
+      </w:pPr>
+    </w:p>
+    <w:p>
+      <w:pPr>
+        <w:rPr>
+          <w:lang w:val="tr-TR"/>
+        </w:rPr>
+      </w:pPr>
+      <w:r>
+        <w:rPr>
+          <w:lang w:val="tr-TR"/>
+        </w:rPr>
+        <w:t>Toplam_çömez_sayısı = toplam_nöbet_sayısı – 30</w:t>
+      </w:r>
+      <w:r>
+        <w:rPr>
+          <w:lang w:val="tr-TR"/>
+        </w:rPr>
+        <w:t>*</w:t>
+      </w:r>
+      <w:r>
+        <w:rPr>
+          <w:lang w:val="tr-TR"/>
+        </w:rPr>
+        <w:t>5</w:t>
+      </w:r>
+      <w:r>
+        <w:rPr>
+          <w:lang w:val="tr-TR"/>
+        </w:rPr>
+        <w:t xml:space="preserve"> (30 çeken aylar için)</w:t>
+      </w:r>
+    </w:p>
+    <w:p>
+      <w:pPr>
+        <w:ind w:left="2160"/>
+        <w:rPr>
+          <w:lang w:val="tr-TR"/>
+        </w:rPr>
+      </w:pPr>
+      <w:r>
+        <w:rPr>
+          <w:lang w:val="tr-TR"/>
+        </w:rPr>
+        <w:t>= toplam_nöbet_sayısı – 31</w:t>
+      </w:r>
+      <w:r>
+        <w:rPr>
+          <w:lang w:val="tr-TR"/>
+        </w:rPr>
+        <w:t>*</w:t>
+      </w:r>
+      <w:r>
+        <w:rPr>
+          <w:lang w:val="tr-TR"/>
+        </w:rPr>
+        <w:t>5 (31 çeken aylar için)</w:t>
+      </w:r>
+    </w:p>
+    <w:p>
+      <w:pPr>
+        <w:rPr>
+          <w:lang w:val="tr-TR"/>
+        </w:rPr>
+      </w:pPr>
+    </w:p>
+    <w:p>
+      <w:pPr>
+        <w:rPr>
+          <w:lang w:val="tr-TR"/>
+        </w:rPr>
+      </w:pPr>
+    </w:p>
+    <w:p>
+      <w:pPr>
+        <w:rPr>
+          <w:lang w:val="tr-TR"/>
+        </w:rPr>
+      </w:pPr>
+      <w:r>
+        <w:rPr>
+          <w:lang w:val="tr-TR"/>
+        </w:rPr>
+        <w:t xml:space="preserve">Aynı doktor için nöbet: </w:t>
+      </w:r>
+    </w:p>
+    <w:p>
+      <w:pPr>
+        <w:rPr>
+          <w:lang w:val="tr-TR"/>
+        </w:rPr>
+      </w:pPr>
+    </w:p>
+    <w:p>
+      <w:pPr>
+        <w:rPr>
+          <w:lang w:val="tr-TR"/>
+        </w:rPr>
+      </w:pPr>
+      <w:r>
+        <w:rPr>
+          <w:lang w:val="tr-TR"/>
+        </w:rPr>
+        <w:t>Aynı gün yalnızca gündüz veya gece nöbet alınabilir.</w:t>
+      </w:r>
+    </w:p>
+    <w:p>
+      <w:pPr>
+        <w:rPr>
+          <w:lang w:val="tr-TR"/>
+        </w:rPr>
+      </w:pPr>
+      <w:r>
+        <w:rPr>
+          <w:lang w:val="tr-TR"/>
+        </w:rPr>
+        <w:t>Bir günün gecesi ve ertesi günün sabahı nöbet olmaz.</w:t>
+      </w:r>
+    </w:p>
+    <w:p>
+      <w:pPr>
+        <w:rPr>
+          <w:lang w:val="tr-TR"/>
+        </w:rPr>
+      </w:pPr>
+      <w:r>
+        <w:rPr>
+          <w:lang w:val="tr-TR"/>
+        </w:rPr>
+        <w:t>Peş peşe 2 günün gece nöbeti okey, peş peşe 3 gece no</w:t>
+      </w:r>
+    </w:p>
+    <w:p>
+      <w:pPr>
+        <w:rPr>
+          <w:lang w:val="tr-TR"/>
+        </w:rPr>
+      </w:pPr>
+      <w:r>
+        <w:rPr>
+          <w:lang w:val="tr-TR"/>
+        </w:rPr>
+        <w:t xml:space="preserve">Sadece spesifik olarak bu gün kombinasyonlarına özel: </w:t>
+      </w:r>
+    </w:p>
+    <w:p>
+      <w:pPr>
+        <w:rPr>
+          <w:lang w:val="tr-TR"/>
+        </w:rPr>
+      </w:pPr>
+      <w:r>
+        <w:rPr>
+          <w:lang w:val="tr-TR"/>
+        </w:rPr>
+        <w:t>Pazartesi gece + Salı sabah + Salı gece olmaz</w:t>
+      </w:r>
+    </w:p>
+    <w:p>
+      <w:pPr>
+        <w:rPr>
+          <w:lang w:val="tr-TR"/>
+        </w:rPr>
+      </w:pPr>
+      <w:r>
+        <w:rPr>
+          <w:lang w:val="tr-TR"/>
+        </w:rPr>
+        <w:t>çarşamba gece + perşembe sabah + perşembe gece olmaz</w:t>
+      </w:r>
+    </w:p>
+    <w:p>
+      <w:pPr>
+        <w:rPr>
+          <w:lang w:val="tr-TR"/>
+        </w:rPr>
+      </w:pPr>
+    </w:p>
+    <w:p>
+      <w:pPr>
+        <w:rPr>
+          <w:lang w:val="tr-TR"/>
+        </w:rPr>
+      </w:pPr>
+      <w:r>
+        <w:rPr>
+          <w:lang w:val="tr-TR"/>
+        </w:rPr>
+        <w:t>-</w:t>
+      </w:r>
+      <w:r>
+        <w:rPr>
+          <w:lang w:val="tr-TR"/>
+        </w:rPr>
+        <w:t>nöbet_sayısı 0 olan doktorları tamamen dışla</w:t>
+      </w:r>
+      <w:r>
+        <w:rPr>
+          <w:lang w:val="tr-TR"/>
+        </w:rPr>
+        <w:t xml:space="preserve">ma, havuzda hard constraint şekilde kalsın. </w:t>
+      </w:r>
+    </w:p>
+    <w:p>
+      <w:pPr>
+        <w:rPr>
+          <w:lang w:val="tr-TR"/>
+        </w:rPr>
+      </w:pPr>
+    </w:p>
+    <w:p>
+      <w:pPr>
+        <w:rPr>
+          <w:lang w:val="tr-TR"/>
+        </w:rPr>
+      </w:pPr>
+      <w:r>
+        <w:rPr>
+          <w:lang w:val="tr-TR"/>
+        </w:rPr>
+        <w:t>Aynı doktoru peş peşe günlere koymayıp nöbetleri random dağıtmaya çalış.</w:t>
+      </w:r>
+    </w:p>
+    <w:p>
+      <w:pPr>
+        <w:rPr>
+          <w:lang w:val="tr-TR"/>
+        </w:rPr>
+      </w:pPr>
+      <w:r>
+        <w:rPr>
+          <w:lang w:val="tr-TR"/>
+        </w:rPr>
+        <w:t xml:space="preserve">Her doktor için gece ve gündüz oranını yaklaşık aynı yapmaya çalış. </w:t>
+      </w:r>
+    </w:p>
+    <w:p>
+      <w:pPr>
+        <w:rPr>
+          <w:lang w:val="tr-TR"/>
+        </w:rPr>
+      </w:pPr>
+    </w:p>
+    <w:p>
+      <w:pPr>
+        <w:rPr>
+          <w:lang w:val="tr-TR"/>
+        </w:rPr>
+      </w:pPr>
+      <w:r>
+        <w:rPr>
+          <w:lang w:val="tr-TR"/>
+        </w:rPr>
+        <w:t>Teknik not: Modelleme yaklaşımı olarak CP-SAT (Google OR-Tools) kullanılacak (kesin-hedef atama problemi olduğu için).</w:t>
+      </w:r>
+    </w:p>
+    <w:p>
+      <w:pPr>
+        <w:rPr>
+          <w:lang w:val="tr-TR"/>
+        </w:rPr>
+      </w:pPr>
+    </w:p>
+    <w:p>
+      <w:pPr>
+        <w:rPr>
+          <w:lang w:val="tr-TR"/>
+        </w:rPr>
+      </w:pPr>
+    </w:p>
+    <w:p>
+      <w:pPr>
+        <w:rPr>
+          <w:u w:val="single"/>
+          <w:lang w:val="tr-TR"/>
+        </w:rPr>
+      </w:pPr>
+      <w:r>
+        <w:rPr>
+          <w:u w:val="single"/>
+          <w:lang w:val="tr-TR"/>
+        </w:rPr>
+        <w:t>ölçeği anlama</w:t>
+      </w:r>
+      <w:r>
+        <w:rPr>
+          <w:u w:val="single"/>
+          <w:lang w:val="tr-TR"/>
+        </w:rPr>
+        <w:t>k</w:t>
+      </w:r>
+      <w:r>
+        <w:rPr>
+          <w:u w:val="single"/>
+          <w:lang w:val="tr-TR"/>
+        </w:rPr>
+        <w:t xml:space="preserve"> için:</w:t>
+      </w:r>
+    </w:p>
+    <w:p>
+      <w:pPr>
+        <w:rPr>
+          <w:lang w:val="tr-TR"/>
+        </w:rPr>
+      </w:pPr>
+    </w:p>
+    <w:p>
+      <w:pPr>
+        <w:rPr>
+          <w:lang w:val="tr-TR"/>
+        </w:rPr>
+      </w:pPr>
+    </w:p>
+    <w:p>
+      <w:pPr>
+        <w:rPr>
+          <w:lang w:val="tr-TR"/>
+        </w:rPr>
+      </w:pPr>
+      <w:r>
+        <w:rPr>
+          <w:lang w:val="tr-TR"/>
+        </w:rPr>
         <w:lastRenderedPageBreak/>
-        <w:t xml:space="preserve"> </w:t>
-      </w:r>
-    </w:p>
-    <w:p>
-      <w:pPr>
-        <w:rPr>
-          <w:lang w:val="tr-TR"/>
-        </w:rPr>
-      </w:pPr>
-      <w:r>
-        <w:rPr>
-          <w:lang w:val="tr-TR"/>
-        </w:rPr>
-        <w:t>1 kıdemli nöbet_başı</w:t>
-      </w:r>
-    </w:p>
-    <w:p>
-      <w:pPr>
-        <w:rPr>
-          <w:lang w:val="tr-TR"/>
-        </w:rPr>
-      </w:pPr>
-      <w:r>
-        <w:rPr>
-          <w:lang w:val="tr-TR"/>
-        </w:rPr>
-        <w:t>En az 1 çömez</w:t>
-      </w:r>
-      <w:r>
-        <w:rPr>
-          <w:lang w:val="tr-TR"/>
-        </w:rPr>
-        <w:t>_başı</w:t>
-      </w:r>
-    </w:p>
-    <w:p>
-      <w:pPr>
-        <w:rPr>
-          <w:lang w:val="tr-TR"/>
-        </w:rPr>
-      </w:pPr>
-      <w:r>
-        <w:rPr>
-          <w:lang w:val="tr-TR"/>
-        </w:rPr>
-        <w:t>Kıdemsiz çömezler</w:t>
-      </w:r>
-    </w:p>
-    <w:p>
-      <w:pPr>
-        <w:rPr>
-          <w:lang w:val="tr-TR"/>
-        </w:rPr>
-      </w:pPr>
-      <w:r>
-        <w:rPr>
-          <w:lang w:val="tr-TR"/>
-        </w:rPr>
-        <w:t>1 kıdemli kapıcı (sadece sabah vardiyasında)</w:t>
-      </w:r>
-    </w:p>
-    <w:p>
-      <w:pPr>
-        <w:rPr>
-          <w:lang w:val="tr-TR"/>
-        </w:rPr>
-      </w:pPr>
-    </w:p>
-    <w:p>
-      <w:pPr>
-        <w:rPr>
-          <w:lang w:val="tr-TR"/>
-        </w:rPr>
-      </w:pPr>
-      <w:r>
-        <w:rPr>
-          <w:lang w:val="tr-TR"/>
-        </w:rPr>
-        <w:t xml:space="preserve">Float </w:t>
-      </w:r>
-      <w:r>
-        <w:rPr>
-          <w:lang w:val="tr-TR"/>
-        </w:rPr>
-        <w:t>Toplam</w:t>
-      </w:r>
-      <w:r>
-        <w:rPr>
-          <w:lang w:val="tr-TR"/>
-        </w:rPr>
-        <w:t>_</w:t>
-      </w:r>
-      <w:r>
-        <w:rPr>
-          <w:lang w:val="tr-TR"/>
-        </w:rPr>
-        <w:t>çömez</w:t>
-      </w:r>
-      <w:r>
-        <w:rPr>
-          <w:lang w:val="tr-TR"/>
-        </w:rPr>
-        <w:t>_</w:t>
-      </w:r>
-      <w:r>
-        <w:rPr>
-          <w:lang w:val="tr-TR"/>
-        </w:rPr>
-        <w:t>sayısı</w:t>
-      </w:r>
-      <w:r>
-        <w:rPr>
-          <w:lang w:val="tr-TR"/>
-        </w:rPr>
-        <w:t>_</w:t>
-      </w:r>
-      <w:r>
-        <w:rPr>
-          <w:lang w:val="tr-TR"/>
-        </w:rPr>
-        <w:t xml:space="preserve">ortalaması için formül: </w:t>
-      </w:r>
-      <w:r>
-        <w:rPr>
-          <w:lang w:val="tr-TR"/>
-        </w:rPr>
-        <w:t>(input olarak hangi ay olduğu girilir)</w:t>
-      </w:r>
-      <w:r>
-        <w:rPr>
-          <w:lang w:val="tr-TR"/>
-        </w:rPr>
-        <w:t xml:space="preserve"> (çömez başını çömez saymıyoruz)</w:t>
-      </w:r>
-    </w:p>
-    <w:p>
-      <w:pPr>
-        <w:rPr>
-          <w:lang w:val="tr-TR"/>
-        </w:rPr>
-      </w:pPr>
-      <w:r>
-        <w:rPr>
-          <w:lang w:val="tr-TR"/>
-        </w:rPr>
-        <w:t xml:space="preserve">30 çeken aylar: </w:t>
-      </w:r>
-      <w:r>
-        <w:rPr>
-          <w:lang w:val="tr-TR"/>
-        </w:rPr>
-        <w:t>(</w:t>
-      </w:r>
-      <w:r>
-        <w:rPr>
-          <w:lang w:val="tr-TR"/>
-        </w:rPr>
-        <w:t>(toplam_nöbet_sayısı – 90)/60</w:t>
-      </w:r>
-      <w:r>
-        <w:rPr>
-          <w:lang w:val="tr-TR"/>
-        </w:rPr>
-        <w:t>) - 1</w:t>
-      </w:r>
-    </w:p>
-    <w:p>
-      <w:pPr>
-        <w:rPr>
-          <w:lang w:val="tr-TR"/>
-        </w:rPr>
-      </w:pPr>
-      <w:r>
-        <w:rPr>
-          <w:lang w:val="tr-TR"/>
-        </w:rPr>
-        <w:t xml:space="preserve">31 çeken aylar: </w:t>
-      </w:r>
-      <w:r>
-        <w:rPr>
-          <w:lang w:val="tr-TR"/>
-        </w:rPr>
-        <w:t>(</w:t>
-      </w:r>
-      <w:r>
-        <w:rPr>
-          <w:lang w:val="tr-TR"/>
-        </w:rPr>
-        <w:t>(toplam_nöbet_sayısı – 93)/62</w:t>
-      </w:r>
-      <w:r>
-        <w:rPr>
-          <w:lang w:val="tr-TR"/>
-        </w:rPr>
-        <w:t>) - 1</w:t>
-      </w:r>
-    </w:p>
-    <w:p>
-      <w:pPr>
-        <w:rPr>
-          <w:lang w:val="tr-TR"/>
-        </w:rPr>
-      </w:pPr>
-    </w:p>
-    <w:p>
-      <w:pPr>
-        <w:rPr>
-          <w:lang w:val="tr-TR"/>
-        </w:rPr>
-      </w:pPr>
-      <w:r>
-        <w:rPr>
-          <w:lang w:val="tr-TR"/>
-        </w:rPr>
-        <w:t xml:space="preserve">Toplam_nöbet_sayısı </w:t>
-      </w:r>
-      <w:r>
-        <w:rPr>
-          <w:lang w:val="tr-TR"/>
-        </w:rPr>
-        <w:t>=</w:t>
-      </w:r>
-      <w:r>
-        <w:rPr>
-          <w:lang w:val="tr-TR"/>
-        </w:rPr>
-        <w:t xml:space="preserve"> doktorlar için nöbet sayısı toplamı</w:t>
-      </w:r>
-    </w:p>
-    <w:p>
-      <w:pPr>
-        <w:rPr>
-          <w:lang w:val="tr-TR"/>
-        </w:rPr>
-      </w:pPr>
-      <w:r>
-        <w:rPr>
-          <w:lang w:val="tr-TR"/>
-        </w:rPr>
-        <w:t xml:space="preserve">Float </w:t>
-      </w:r>
-      <w:r>
-        <w:rPr>
-          <w:lang w:val="tr-TR"/>
-        </w:rPr>
-        <w:t xml:space="preserve"> </w:t>
-      </w:r>
-      <w:r>
-        <w:rPr>
-          <w:lang w:val="tr-TR"/>
-        </w:rPr>
-        <w:t>toplam_çömez_sayısı</w:t>
-      </w:r>
-      <w:r>
-        <w:rPr>
-          <w:lang w:val="tr-TR"/>
-        </w:rPr>
-        <w:t>_ortalaması d</w:t>
-      </w:r>
-      <w:r>
-        <w:rPr>
-          <w:lang w:val="tr-TR"/>
-        </w:rPr>
-        <w:t xml:space="preserve">ağıtım kuralı (küsuratlı ortalama için): </w:t>
-      </w:r>
-    </w:p>
-    <w:p>
-      <w:pPr>
-        <w:rPr>
-          <w:lang w:val="tr-TR"/>
-        </w:rPr>
-      </w:pPr>
-      <w:r>
-        <w:rPr>
-          <w:lang w:val="tr-TR"/>
-        </w:rPr>
-        <w:t xml:space="preserve">Ortalama küsuratlıysa, toplam_çömez_sayısı kadar tam sayı slot, bazı nöbetlerde taban(floor), bazılarında tavan(ceil) olacak şekilde dağıtılır. </w:t>
-      </w:r>
-      <w:r>
-        <w:rPr>
-          <w:lang w:val="tr-TR"/>
-        </w:rPr>
-        <w:t>gece</w:t>
-      </w:r>
-      <w:r>
-        <w:rPr>
-          <w:lang w:val="tr-TR"/>
-        </w:rPr>
-        <w:t xml:space="preserve"> nöbetler öncelikli tavan alır</w:t>
-      </w:r>
-      <w:r>
-        <w:rPr>
-          <w:lang w:val="tr-TR"/>
-        </w:rPr>
-        <w:t xml:space="preserve"> (random). </w:t>
-      </w:r>
-    </w:p>
-    <w:p>
-      <w:pPr>
-        <w:rPr>
-          <w:lang w:val="tr-TR"/>
-        </w:rPr>
-      </w:pPr>
-    </w:p>
-    <w:p>
-      <w:pPr>
-        <w:rPr>
-          <w:lang w:val="tr-TR"/>
-        </w:rPr>
-      </w:pPr>
-      <w:r>
-        <w:rPr>
-          <w:lang w:val="tr-TR"/>
-        </w:rPr>
-        <w:t>Toplam_çömez_sayısı = toplam_nöbet_sayısı – 30</w:t>
-      </w:r>
-      <w:r>
-        <w:rPr>
-          <w:lang w:val="tr-TR"/>
-        </w:rPr>
-        <w:t>*</w:t>
-      </w:r>
-      <w:r>
-        <w:rPr>
-          <w:lang w:val="tr-TR"/>
-        </w:rPr>
-        <w:t>5</w:t>
-      </w:r>
-      <w:r>
-        <w:rPr>
-          <w:lang w:val="tr-TR"/>
-        </w:rPr>
-        <w:t xml:space="preserve"> (30 çeken aylar için)</w:t>
-      </w:r>
-    </w:p>
-    <w:p>
-      <w:pPr>
-        <w:ind w:left="2160"/>
-        <w:rPr>
-          <w:lang w:val="tr-TR"/>
-        </w:rPr>
-      </w:pPr>
-      <w:r>
-        <w:rPr>
-          <w:lang w:val="tr-TR"/>
-        </w:rPr>
-        <w:t>= toplam_nöbet_sayısı – 31</w:t>
-      </w:r>
-      <w:r>
-        <w:rPr>
-          <w:lang w:val="tr-TR"/>
-        </w:rPr>
-        <w:t>*</w:t>
-      </w:r>
-      <w:r>
-        <w:rPr>
-          <w:lang w:val="tr-TR"/>
-        </w:rPr>
-        <w:t>5 (31 çeken aylar için)</w:t>
-      </w:r>
-    </w:p>
-    <w:p>
-      <w:pPr>
-        <w:rPr>
-          <w:lang w:val="tr-TR"/>
-        </w:rPr>
-      </w:pPr>
-    </w:p>
-    <w:p>
-      <w:pPr>
-        <w:rPr>
-          <w:lang w:val="tr-TR"/>
-        </w:rPr>
-      </w:pPr>
-    </w:p>
-    <w:p>
-      <w:pPr>
-        <w:rPr>
-          <w:lang w:val="tr-TR"/>
-        </w:rPr>
-      </w:pPr>
-      <w:r>
-        <w:rPr>
-          <w:lang w:val="tr-TR"/>
-        </w:rPr>
-        <w:t xml:space="preserve">Aynı doktor için nöbet: </w:t>
-      </w:r>
-    </w:p>
-    <w:p>
-      <w:pPr>
-        <w:rPr>
-          <w:lang w:val="tr-TR"/>
-        </w:rPr>
-      </w:pPr>
-    </w:p>
-    <w:p>
-      <w:pPr>
-        <w:rPr>
-          <w:lang w:val="tr-TR"/>
-        </w:rPr>
-      </w:pPr>
-      <w:r>
-        <w:rPr>
-          <w:lang w:val="tr-TR"/>
-        </w:rPr>
-        <w:t>Aynı gün yalnızca gündüz veya gece nöbet alınabilir.</w:t>
-      </w:r>
-    </w:p>
-    <w:p>
-      <w:pPr>
-        <w:rPr>
-          <w:lang w:val="tr-TR"/>
-        </w:rPr>
-      </w:pPr>
-      <w:r>
-        <w:rPr>
-          <w:lang w:val="tr-TR"/>
-        </w:rPr>
-        <w:t>Bir günün gecesi ve ertesi günün sabahı nöbet olmaz.</w:t>
-      </w:r>
-    </w:p>
-    <w:p>
-      <w:pPr>
-        <w:rPr>
-          <w:lang w:val="tr-TR"/>
-        </w:rPr>
-      </w:pPr>
-      <w:r>
-        <w:rPr>
-          <w:lang w:val="tr-TR"/>
-        </w:rPr>
-        <w:t>Peş peşe 2 günün gece nöbeti okey, peş peşe 3 gece no</w:t>
-      </w:r>
-    </w:p>
-    <w:p>
-      <w:pPr>
-        <w:rPr>
-          <w:lang w:val="tr-TR"/>
-        </w:rPr>
-      </w:pPr>
-      <w:r>
-        <w:rPr>
-          <w:lang w:val="tr-TR"/>
-        </w:rPr>
-        <w:t xml:space="preserve">Sadece spesifik olarak bu gün kombinasyonlarına özel: </w:t>
-      </w:r>
-    </w:p>
-    <w:p>
-      <w:pPr>
-        <w:rPr>
-          <w:lang w:val="tr-TR"/>
-        </w:rPr>
-      </w:pPr>
-      <w:r>
-        <w:rPr>
-          <w:lang w:val="tr-TR"/>
-        </w:rPr>
-        <w:t>Pazartesi gece + Salı sabah + Salı gece olmaz</w:t>
-      </w:r>
-    </w:p>
-    <w:p>
-      <w:pPr>
-        <w:rPr>
-          <w:lang w:val="tr-TR"/>
-        </w:rPr>
-      </w:pPr>
-      <w:r>
-        <w:rPr>
-          <w:lang w:val="tr-TR"/>
-        </w:rPr>
-        <w:t>çarşamba gece + perşembe sabah + perşembe gece olmaz</w:t>
-      </w:r>
-    </w:p>
-    <w:p>
-      <w:pPr>
-        <w:rPr>
-          <w:lang w:val="tr-TR"/>
-        </w:rPr>
-      </w:pPr>
-    </w:p>
-    <w:p>
-      <w:pPr>
-        <w:rPr>
-          <w:lang w:val="tr-TR"/>
-        </w:rPr>
-      </w:pPr>
-      <w:r>
-        <w:rPr>
-          <w:lang w:val="tr-TR"/>
-        </w:rPr>
-        <w:t>-</w:t>
-      </w:r>
-      <w:r>
-        <w:rPr>
-          <w:lang w:val="tr-TR"/>
-        </w:rPr>
-        <w:t>nöbet_sayısı 0 olan doktorları tamamen dışla</w:t>
-      </w:r>
-      <w:r>
-        <w:rPr>
-          <w:lang w:val="tr-TR"/>
-        </w:rPr>
-        <w:t xml:space="preserve">ma, havuzda hard constraint şekilde kalsın. </w:t>
-      </w:r>
-    </w:p>
-    <w:p>
-      <w:pPr>
-        <w:rPr>
-          <w:lang w:val="tr-TR"/>
-        </w:rPr>
-      </w:pPr>
-    </w:p>
-    <w:p>
-      <w:pPr>
-        <w:rPr>
-          <w:lang w:val="tr-TR"/>
-        </w:rPr>
-      </w:pPr>
-      <w:r>
-        <w:rPr>
-          <w:lang w:val="tr-TR"/>
-        </w:rPr>
-        <w:t>Aynı doktoru peş peşe günlere koymayıp nöbetleri random dağıtmaya çalış.</w:t>
-      </w:r>
-    </w:p>
-    <w:p>
-      <w:pPr>
-        <w:rPr>
-          <w:lang w:val="tr-TR"/>
-        </w:rPr>
-      </w:pPr>
-      <w:r>
-        <w:rPr>
-          <w:lang w:val="tr-TR"/>
-        </w:rPr>
-        <w:t xml:space="preserve">Her doktor için gece ve gündüz oranını yaklaşık aynı yapmaya çalış. </w:t>
-      </w:r>
-    </w:p>
-    <w:p>
-      <w:pPr>
-        <w:rPr>
-          <w:lang w:val="tr-TR"/>
-        </w:rPr>
-      </w:pPr>
-    </w:p>
-    <w:p>
-      <w:pPr>
-        <w:rPr>
-          <w:lang w:val="tr-TR"/>
-        </w:rPr>
-      </w:pPr>
-      <w:r>
-        <w:rPr>
-          <w:lang w:val="tr-TR"/>
-        </w:rPr>
-        <w:t>Teknik not: Modelleme yaklaşımı olarak CP-SAT (Google OR-Tools) kullanılacak (kesin-hedef atama problemi olduğu için).</w:t>
-      </w:r>
-    </w:p>
-    <w:p>
-      <w:pPr>
-        <w:rPr>
-          <w:lang w:val="tr-TR"/>
-        </w:rPr>
-      </w:pPr>
-    </w:p>
-    <w:p>
-      <w:pPr>
-        <w:rPr>
-          <w:lang w:val="tr-TR"/>
-        </w:rPr>
-      </w:pPr>
-    </w:p>
-    <w:p>
-      <w:pPr>
-        <w:rPr>
-          <w:u w:val="single"/>
-          <w:lang w:val="tr-TR"/>
-        </w:rPr>
-      </w:pPr>
-      <w:r>
-        <w:rPr>
-          <w:u w:val="single"/>
-          <w:lang w:val="tr-TR"/>
-        </w:rPr>
-        <w:t>ölçeği anlama</w:t>
-      </w:r>
-      <w:r>
-        <w:rPr>
-          <w:u w:val="single"/>
-          <w:lang w:val="tr-TR"/>
-        </w:rPr>
-        <w:t>k</w:t>
-      </w:r>
-      <w:r>
-        <w:rPr>
-          <w:u w:val="single"/>
-          <w:lang w:val="tr-TR"/>
-        </w:rPr>
-        <w:t xml:space="preserve"> için:</w:t>
-      </w:r>
-    </w:p>
-    <w:p>
-      <w:pPr>
-        <w:rPr>
-          <w:lang w:val="tr-TR"/>
-        </w:rPr>
-      </w:pPr>
-    </w:p>
-    <w:p>
-      <w:pPr>
-        <w:rPr>
-          <w:lang w:val="tr-TR"/>
-        </w:rPr>
-      </w:pPr>
-    </w:p>
-    <w:p>
-      <w:pPr>
-        <w:rPr>
-          <w:lang w:val="tr-TR"/>
-        </w:rPr>
-      </w:pPr>
-      <w:r>
-        <w:rPr>
-          <w:lang w:val="tr-TR"/>
-        </w:rPr>
         <w:t>doktor sayıları:</w:t>
       </w:r>
     </w:p>

</xml_diff>